<commit_message>
fix: address remaining wording and consistency issues
</commit_message>
<xml_diff>
--- a/build_expanded/cover_letter.docx
+++ b/build_expanded/cover_letter.docx
@@ -24,7 +24,19 @@
         <w:pStyle w:val="BodyText"/>
       </w:pPr>
       <w:r>
-        <w:t xml:space="preserve">Re: Submission of “Calibration-derived decoder discriminability is associated with online P300-speller accuracy, but the fitted mapping does not transport across cohorts” as a Paper</w:t>
+        <w:t xml:space="preserve">Re: Submission of</w:t>
+      </w:r>
+      <w:r>
+        <w:t xml:space="preserve"> </w:t>
+      </w:r>
+      <w:r>
+        <w:t xml:space="preserve">“Calibration-derived decoder discriminability is associated with online P300-speller accuracy, but the fitted mapping does not transport across cohorts”</w:t>
+      </w:r>
+      <w:r>
+        <w:t xml:space="preserve"> </w:t>
+      </w:r>
+      <w:r>
+        <w:t xml:space="preserve">as a Paper</w:t>
       </w:r>
     </w:p>
     <w:p>
@@ -53,19 +65,7 @@
         <w:pStyle w:val="BodyText"/>
       </w:pPr>
       <w:r>
-        <w:t xml:space="preserve">We submit</w:t>
-      </w:r>
-      <w:r>
-        <w:t xml:space="preserve"> </w:t>
-      </w:r>
-      <w:r>
-        <w:t xml:space="preserve">“Calibration-derived decoder discriminability is associated with online P300-speller accuracy, but the fitted mapping does not transport across cohorts”</w:t>
-      </w:r>
-      <w:r>
-        <w:t xml:space="preserve"> </w:t>
-      </w:r>
-      <w:r>
-        <w:t xml:space="preserve">for consideration as a Paper in</w:t>
+        <w:t xml:space="preserve">We submit the manuscript named above for consideration as a Paper in</w:t>
       </w:r>
       <w:r>
         <w:t xml:space="preserve"> </w:t>

</xml_diff>